<commit_message>
Fix final report typos
</commit_message>
<xml_diff>
--- a/fins2026/z5642794_projectB/report/report.docx
+++ b/fins2026/z5642794_projectB/report/report.docx
@@ -116,23 +116,7 @@
           <w:rFonts w:eastAsia="宋体"/>
           <w:lang w:eastAsia="zh-CN"/>
         </w:rPr>
-        <w:t xml:space="preserve">Wealth Radar is a prototype dashboard for investors which visualizes systematic multi-asset funds and </w:t>
-      </w:r>
-      <w:proofErr w:type="gramStart"/>
-      <w:r>
-        <w:rPr>
-          <w:rFonts w:eastAsia="宋体"/>
-          <w:lang w:eastAsia="zh-CN"/>
-        </w:rPr>
-        <w:t>news based</w:t>
-      </w:r>
-      <w:proofErr w:type="gramEnd"/>
-      <w:r>
-        <w:rPr>
-          <w:rFonts w:eastAsia="宋体"/>
-          <w:lang w:eastAsia="zh-CN"/>
-        </w:rPr>
-        <w:t xml:space="preserve"> sentiment analysis across equity sectors. It was created to help non-technical investors understand and draw insights from quantitative investment results. The data from the </w:t>
+        <w:t xml:space="preserve">Wealth Radar is a prototype dashboard for investors which visualizes systematic multi-asset funds and news based sentiment analysis across equity sectors. It was created to help non-technical investors understand and draw insights from quantitative investment results. The data from the </w:t>
       </w:r>
       <w:proofErr w:type="spellStart"/>
       <w:r>
@@ -179,23 +163,7 @@
           <w:rFonts w:eastAsia="宋体"/>
           <w:lang w:eastAsia="zh-CN"/>
         </w:rPr>
-        <w:t xml:space="preserve">The results of the primary test suggest that the combined equal-weight fund yielded the best risk-adjusted return, with an annualized return of 18.29%, annualized volatility of 21.46%, and a Sharpe ratio of 0.89. This result is surprising because it suggests that a simple, transparent rule is hard to beat and that more advanced rules do not yield important benefits. The combined minimum-variance fund had lower volatility and drawdown, but produced only a 5.07% annualized return. The sentiment-tilted equity fund slightly underperformed its equal-weight equity benchmark as well. The crypto minimum-variance extension had an annualized return of 21.28%, volatility of 62.17%, and maximum drawdown of 75.60%. The performance was an improvement over the basic minimum-variance strategy, though still with a very </w:t>
-      </w:r>
-      <w:proofErr w:type="gramStart"/>
-      <w:r>
-        <w:rPr>
-          <w:rFonts w:eastAsia="宋体"/>
-          <w:lang w:eastAsia="zh-CN"/>
-        </w:rPr>
-        <w:t>high risk</w:t>
-      </w:r>
-      <w:proofErr w:type="gramEnd"/>
-      <w:r>
-        <w:rPr>
-          <w:rFonts w:eastAsia="宋体"/>
-          <w:lang w:eastAsia="zh-CN"/>
-        </w:rPr>
-        <w:t xml:space="preserve"> profile.</w:t>
+        <w:t>The results of the primary test suggest that the combined equal-weight fund yielded the best risk-adjusted return, with an annualized return of 18.29%, annualized volatility of 21.46%, and a Sharpe ratio of 0.89. This result is surprising because it suggests that a simple, transparent rule is hard to beat and that more advanced rules do not yield important benefits. The combined minimum-variance fund had lower volatility and drawdown, but produced only a 5.07% annualized return. The sentiment-tilted equity fund slightly underperformed its equal-weight equity benchmark as well. The crypto minimum-variance extension had an annualized return of 21.28%, volatility of 62.17%, and maximum drawdown of 75.60%. The performance was an improvement over the basic minimum-variance strategy, though still with a very high risk profile.</w:t>
       </w:r>
     </w:p>
     <w:p>
@@ -231,7 +199,7 @@
     <w:p>
       <w:pPr>
         <w:rPr>
-          <w:rFonts w:eastAsia="宋体" w:hint="eastAsia"/>
+          <w:rFonts w:eastAsia="宋体"/>
           <w:lang w:eastAsia="zh-CN"/>
         </w:rPr>
       </w:pPr>
@@ -346,7 +314,7 @@
     <w:p>
       <w:pPr>
         <w:rPr>
-          <w:rFonts w:eastAsia="宋体" w:hint="eastAsia"/>
+          <w:rFonts w:eastAsia="宋体"/>
           <w:lang w:eastAsia="zh-CN"/>
         </w:rPr>
       </w:pPr>
@@ -517,32 +485,16 @@
     <w:p>
       <w:pPr>
         <w:rPr>
-          <w:rFonts w:eastAsia="宋体" w:hint="eastAsia"/>
-          <w:lang w:eastAsia="zh-CN"/>
-        </w:rPr>
-      </w:pPr>
-      <w:proofErr w:type="spellStart"/>
-      <w:r>
-        <w:rPr>
-          <w:rFonts w:eastAsia="宋体" w:hint="eastAsia"/>
-          <w:lang w:eastAsia="zh-CN"/>
-        </w:rPr>
-        <w:t>ss</w:t>
-      </w:r>
-      <w:r>
-        <w:rPr>
-          <w:rFonts w:eastAsia="宋体"/>
-          <w:lang w:eastAsia="zh-CN"/>
-        </w:rPr>
-        <w:t>Annualized</w:t>
-      </w:r>
-      <w:proofErr w:type="spellEnd"/>
-      <w:r>
-        <w:rPr>
-          <w:rFonts w:eastAsia="宋体"/>
-          <w:lang w:eastAsia="zh-CN"/>
-        </w:rPr>
-        <w:t xml:space="preserve"> return is wealth growth compounded over the course of the entire live </w:t>
+          <w:rFonts w:eastAsia="宋体"/>
+          <w:lang w:eastAsia="zh-CN"/>
+        </w:rPr>
+      </w:pPr>
+      <w:r>
+        <w:rPr>
+          <w:rFonts w:eastAsia="宋体"/>
+          <w:lang w:eastAsia="zh-CN"/>
+        </w:rPr>
+        <w:t xml:space="preserve">Annualized return is wealth growth compounded over the course of the entire live </w:t>
       </w:r>
       <w:proofErr w:type="spellStart"/>
       <w:r>
@@ -1206,32 +1158,16 @@
     <w:p>
       <w:pPr>
         <w:rPr>
-          <w:rFonts w:eastAsia="宋体" w:hint="eastAsia"/>
-          <w:lang w:eastAsia="zh-CN"/>
-        </w:rPr>
-      </w:pPr>
-      <w:r>
-        <w:rPr>
-          <w:rFonts w:eastAsia="宋体"/>
-          <w:lang w:eastAsia="zh-CN"/>
-        </w:rPr>
-        <w:t xml:space="preserve">The crypto-only funds have a few different properties. The annualized return of the crypto equal-weight fund was 16.14% while the volatility was 78.87% and the maximum drawdown was -81.60%. Its annualized return was close to the combined equal-weight fund, but its volatility and drawdown were much worse. This means that, for most investors, holding the strategy throughout the sample period would have been very difficult. The crypto minimum-variance fund still outperforms the crypto equal-weight fund, achieving a higher 21.28% annualized return, a lower 62.17% annualized volatility, and a smaller -75.60% maximum drawdown, while being vastly </w:t>
-      </w:r>
-      <w:proofErr w:type="gramStart"/>
-      <w:r>
-        <w:rPr>
-          <w:rFonts w:eastAsia="宋体"/>
-          <w:lang w:eastAsia="zh-CN"/>
-        </w:rPr>
-        <w:t>more risky</w:t>
-      </w:r>
-      <w:proofErr w:type="gramEnd"/>
-      <w:r>
-        <w:rPr>
-          <w:rFonts w:eastAsia="宋体"/>
-          <w:lang w:eastAsia="zh-CN"/>
-        </w:rPr>
-        <w:t xml:space="preserve"> than the combined funds. Consequently, the crypto minimum variance fund cannot be seen as a better fund just because it has a higher annualized return.</w:t>
+          <w:rFonts w:eastAsia="宋体"/>
+          <w:lang w:eastAsia="zh-CN"/>
+        </w:rPr>
+      </w:pPr>
+      <w:r>
+        <w:rPr>
+          <w:rFonts w:eastAsia="宋体"/>
+          <w:lang w:eastAsia="zh-CN"/>
+        </w:rPr>
+        <w:t>The crypto-only funds have a few different properties. The annualized return of the crypto equal-weight fund was 16.14% while the volatility was 78.87% and the maximum drawdown was -81.60%. Its annualized return was close to the combined equal-weight fund, but its volatility and drawdown were much worse. This means that, for most investors, holding the strategy throughout the sample period would have been very difficult. The crypto minimum-variance fund still outperforms the crypto equal-weight fund, achieving a higher 21.28% annualized return, a lower 62.17% annualized volatility, and a smaller -75.60% maximum drawdown, while being vastly more risky than the combined funds. Consequently, the crypto minimum variance fund cannot be seen as a better fund just because it has a higher annualized return.</w:t>
       </w:r>
     </w:p>
     <w:p>
@@ -1294,7 +1230,7 @@
     <w:p>
       <w:pPr>
         <w:rPr>
-          <w:rFonts w:eastAsia="宋体" w:hint="eastAsia"/>
+          <w:rFonts w:eastAsia="宋体"/>
           <w:lang w:eastAsia="zh-CN"/>
         </w:rPr>
       </w:pPr>
@@ -1367,7 +1303,7 @@
     <w:p>
       <w:pPr>
         <w:rPr>
-          <w:rFonts w:eastAsia="宋体" w:hint="eastAsia"/>
+          <w:rFonts w:eastAsia="宋体"/>
           <w:lang w:eastAsia="zh-CN"/>
         </w:rPr>
       </w:pPr>
@@ -1439,35 +1375,17 @@
     <w:p>
       <w:pPr>
         <w:rPr>
-          <w:rFonts w:eastAsia="宋体" w:hint="eastAsia"/>
-          <w:lang w:eastAsia="zh-CN"/>
-        </w:rPr>
-      </w:pPr>
-      <w:r>
-        <w:rPr>
-          <w:rFonts w:eastAsia="宋体"/>
-          <w:lang w:eastAsia="zh-CN"/>
-        </w:rPr>
-        <w:t xml:space="preserve">Figure 3 shows annualized risk against the annualized return. The minimum variance fund, being that it moves down and to the left, has lower volatility and lower annualized return. Although this is the goal of the strategy, the decrease in return was larger than the decrease in risk. The equal-weight fund is therefore further up the chart, having a higher Sharpe ratio, and hence is more preferred in the combined-fund </w:t>
-      </w:r>
-      <w:proofErr w:type="spellStart"/>
-      <w:proofErr w:type="gramStart"/>
-      <w:r>
-        <w:rPr>
-          <w:rFonts w:eastAsia="宋体"/>
-          <w:lang w:eastAsia="zh-CN"/>
-        </w:rPr>
-        <w:t>case.</w:t>
-      </w:r>
-      <w:r>
-        <w:rPr>
-          <w:rFonts w:eastAsia="宋体" w:hint="eastAsia"/>
-          <w:lang w:eastAsia="zh-CN"/>
-        </w:rPr>
-        <w:t>s</w:t>
-      </w:r>
-      <w:proofErr w:type="spellEnd"/>
-      <w:proofErr w:type="gramEnd"/>
+          <w:rFonts w:eastAsia="宋体"/>
+          <w:lang w:eastAsia="zh-CN"/>
+        </w:rPr>
+      </w:pPr>
+      <w:r>
+        <w:rPr>
+          <w:rFonts w:eastAsia="宋体"/>
+          <w:lang w:eastAsia="zh-CN"/>
+        </w:rPr>
+        <w:t>Figure 3 shows annualized risk against the annualized return. The minimum variance fund, being that it moves down and to the left, has lower volatility and lower annualized return. Although this is the goal of the strategy, the decrease in return was larger than the decrease in risk. The equal-weight fund is therefore further up the chart, having a higher Sharpe ratio, and hence is more preferred in the combined-fund case.</w:t>
+      </w:r>
     </w:p>
     <w:p>
       <w:pPr>
@@ -1545,7 +1463,7 @@
     <w:p>
       <w:pPr>
         <w:rPr>
-          <w:rFonts w:eastAsia="宋体" w:hint="eastAsia"/>
+          <w:rFonts w:eastAsia="宋体"/>
           <w:lang w:eastAsia="zh-CN"/>
         </w:rPr>
       </w:pPr>
@@ -1587,7 +1505,7 @@
     <w:p>
       <w:pPr>
         <w:rPr>
-          <w:rFonts w:eastAsia="宋体" w:hint="eastAsia"/>
+          <w:rFonts w:eastAsia="宋体"/>
           <w:lang w:eastAsia="zh-CN"/>
         </w:rPr>
       </w:pPr>
@@ -1698,7 +1616,7 @@
     <w:p>
       <w:pPr>
         <w:rPr>
-          <w:rFonts w:eastAsia="宋体" w:hint="eastAsia"/>
+          <w:rFonts w:eastAsia="宋体"/>
           <w:lang w:eastAsia="zh-CN"/>
         </w:rPr>
       </w:pPr>
@@ -1763,7 +1681,7 @@
     <w:p>
       <w:pPr>
         <w:rPr>
-          <w:rFonts w:eastAsia="宋体" w:hint="eastAsia"/>
+          <w:rFonts w:eastAsia="宋体"/>
           <w:lang w:eastAsia="zh-CN"/>
         </w:rPr>
       </w:pPr>
@@ -2270,7 +2188,7 @@
     <w:p>
       <w:pPr>
         <w:rPr>
-          <w:rFonts w:eastAsia="宋体" w:hint="eastAsia"/>
+          <w:rFonts w:eastAsia="宋体"/>
           <w:lang w:eastAsia="zh-CN"/>
         </w:rPr>
       </w:pPr>
@@ -2337,13 +2255,6 @@
           </wp:inline>
         </w:drawing>
       </w:r>
-      <w:r>
-        <w:rPr>
-          <w:rFonts w:eastAsia="宋体" w:hint="eastAsia"/>
-          <w:lang w:eastAsia="zh-CN"/>
-        </w:rPr>
-        <w:t>s</w:t>
-      </w:r>
     </w:p>
     <w:p>
       <w:pPr>
@@ -2360,16 +2271,16 @@
     <w:p>
       <w:pPr>
         <w:rPr>
-          <w:rFonts w:eastAsia="宋体" w:hint="eastAsia"/>
-          <w:lang w:eastAsia="zh-CN"/>
-        </w:rPr>
-      </w:pPr>
-      <w:r>
-        <w:rPr>
-          <w:rFonts w:eastAsia="宋体"/>
-          <w:lang w:eastAsia="zh-CN"/>
-        </w:rPr>
-        <w:t xml:space="preserve">Looking at Table 1, the crypto minimum variance had the highest annualized return rate at 21.28%. However, it did not outperform the combined equal-weight fund from a risk standpoint, as its volatility of </w:t>
+          <w:rFonts w:eastAsia="宋体"/>
+          <w:lang w:eastAsia="zh-CN"/>
+        </w:rPr>
+      </w:pPr>
+      <w:r>
+        <w:rPr>
+          <w:rFonts w:eastAsia="宋体"/>
+          <w:lang w:eastAsia="zh-CN"/>
+        </w:rPr>
+        <w:t xml:space="preserve">Looking at Table 1, the crypto minimum variance had the highest annualized return rate at 21.28%. However, it did not outperform the combined equal-weight fund from a risk standpoint, as its volatility of 62.17% was almost three times that of the combined equal-weight fund's 21.46% volatility. Its maximum </w:t>
       </w:r>
       <w:r>
         <w:rPr>
@@ -2377,7 +2288,7 @@
           <w:lang w:eastAsia="zh-CN"/>
         </w:rPr>
         <w:lastRenderedPageBreak/>
-        <w:t>62.17% was almost three times that of the combined equal-weight fund's 21.46% volatility. Its maximum drawdown of -75.60% was worse than the combined equal-weight fund's -27.16%, and its Sharpe ratio of 0.62 was lower than the equal-weight fund's 0.89. Given the target weights of approximately 52.40% TRX, 39.58% BTC, 8.03% ETH, and negligible other assets, the fund is highly concentrated at the last rebalance. Thus, instead of showing that crypto minimum variance is the best overall fund, the extension shows calendar-aware design, covariance instability, fund concentration, and the potential for concentration risk in a small crypto universe.</w:t>
+        <w:t>drawdown of -75.60% was worse than the combined equal-weight fund's -27.16%, and its Sharpe ratio of 0.62 was lower than the equal-weight fund's 0.89. Given the target weights of approximately 52.40% TRX, 39.58% BTC, 8.03% ETH, and negligible other assets, the fund is highly concentrated at the last rebalance. Thus, instead of showing that crypto minimum variance is the best overall fund, the extension shows calendar-aware design, covariance instability, fund concentration, and the potential for concentration risk in a small crypto universe.</w:t>
       </w:r>
     </w:p>
     <w:p>
@@ -2496,7 +2407,7 @@
     <w:p>
       <w:pPr>
         <w:rPr>
-          <w:rFonts w:eastAsia="宋体" w:hint="eastAsia"/>
+          <w:rFonts w:eastAsia="宋体"/>
           <w:lang w:eastAsia="zh-CN"/>
         </w:rPr>
       </w:pPr>
@@ -2578,14 +2489,21 @@
           <w:rFonts w:eastAsia="宋体"/>
           <w:lang w:eastAsia="zh-CN"/>
         </w:rPr>
+        <w:t xml:space="preserve">The sentiment experiment was an association test, not a causal experiment. Although VADER is interpretable, it has a general-purpose lexicon that is not designed explicitly for the finance domain. It </w:t>
+      </w:r>
+      <w:r>
+        <w:rPr>
+          <w:rFonts w:eastAsia="宋体"/>
+          <w:lang w:eastAsia="zh-CN"/>
+        </w:rPr>
         <w:lastRenderedPageBreak/>
-        <w:t>The sentiment experiment was an association test, not a causal experiment. Although VADER is interpretable, it has a general-purpose lexicon that is not designed explicitly for the finance domain. It may therefore miss phrases specific to finance such as liability, beat, miss, or downgrade. In the absence of the actual intraday publication time of the news, the pipeline employs a conservative set of date rules that adds a day of lag. Though this minimizes look-ahead bias, it may also lose useful information. The index is conditional on news coverage: days on which there is no news in a sector are excluded.</w:t>
+        <w:t>may therefore miss phrases specific to finance such as liability, beat, miss, or downgrade. In the absence of the actual intraday publication time of the news, the pipeline employs a conservative set of date rules that adds a day of lag. Though this minimizes look-ahead bias, it may also lose useful information. The index is conditional on news coverage: days on which there is no news in a sector are excluded.</w:t>
       </w:r>
     </w:p>
     <w:p>
       <w:pPr>
         <w:rPr>
-          <w:rFonts w:eastAsia="宋体" w:hint="eastAsia"/>
+          <w:rFonts w:eastAsia="宋体"/>
           <w:lang w:eastAsia="zh-CN"/>
         </w:rPr>
       </w:pPr>
@@ -2620,7 +2538,7 @@
     <w:p>
       <w:pPr>
         <w:rPr>
-          <w:rFonts w:eastAsia="宋体" w:hint="eastAsia"/>
+          <w:rFonts w:eastAsia="宋体"/>
           <w:lang w:eastAsia="zh-CN"/>
         </w:rPr>
       </w:pPr>
@@ -2647,7 +2565,7 @@
     <w:p>
       <w:pPr>
         <w:rPr>
-          <w:rFonts w:eastAsia="宋体" w:hint="eastAsia"/>
+          <w:rFonts w:eastAsia="宋体"/>
           <w:lang w:eastAsia="zh-CN"/>
         </w:rPr>
       </w:pPr>
@@ -2674,7 +2592,7 @@
     <w:p>
       <w:pPr>
         <w:rPr>
-          <w:rFonts w:eastAsia="宋体" w:hint="eastAsia"/>
+          <w:rFonts w:eastAsia="宋体"/>
           <w:lang w:eastAsia="zh-CN"/>
         </w:rPr>
       </w:pPr>
@@ -2805,15 +2723,7 @@
           <w:rFonts w:eastAsia="宋体"/>
           <w:lang w:eastAsia="zh-CN"/>
         </w:rPr>
-        <w:t xml:space="preserve">-aware, causing mismatches. I also noticed that some log-scale growth charts in the UI were displayed in scientific notation and </w:t>
-      </w:r>
-      <w:r>
-        <w:rPr>
-          <w:rFonts w:eastAsia="宋体"/>
-          <w:lang w:eastAsia="zh-CN"/>
-        </w:rPr>
-        <w:lastRenderedPageBreak/>
-        <w:t xml:space="preserve">updated them to dollar amounts. When tested individually, the </w:t>
+        <w:t xml:space="preserve">-aware, causing mismatches. I also noticed that some log-scale growth charts in the UI were displayed in scientific notation and updated them to dollar amounts. When tested individually, the </w:t>
       </w:r>
       <w:proofErr w:type="spellStart"/>
       <w:r>
@@ -2844,13 +2754,14 @@
           <w:rFonts w:eastAsia="宋体"/>
           <w:lang w:eastAsia="zh-CN"/>
         </w:rPr>
+        <w:lastRenderedPageBreak/>
         <w:t>In this case, generated code should not be trusted without review, because it models multiple risks including covariance instability, ignoring trading costs, a subjective choice of sentiment window and tilt cap, using a general-English model VADER, and differences in trading calendars for equities and cryptocurrencies. I kept the negative sentiment-fusion result instead of tuning the model until it looked better, because this felt more honest and separated evidence from performance-driven model selection.</w:t>
       </w:r>
     </w:p>
     <w:p>
       <w:pPr>
         <w:rPr>
-          <w:rFonts w:eastAsia="宋体" w:hint="eastAsia"/>
+          <w:rFonts w:eastAsia="宋体"/>
           <w:lang w:eastAsia="zh-CN"/>
         </w:rPr>
       </w:pPr>
@@ -2867,23 +2778,8 @@
         <w:pStyle w:val="1"/>
       </w:pPr>
       <w:r>
-        <w:t xml:space="preserve">12. References and methods </w:t>
-      </w:r>
-      <w:proofErr w:type="gramStart"/>
-      <w:r>
-        <w:t>notes</w:t>
-      </w:r>
-      <w:proofErr w:type="gramEnd"/>
-    </w:p>
-    <w:p>
-      <w:r>
-        <w:t xml:space="preserve">12. References and methods </w:t>
-      </w:r>
-      <w:proofErr w:type="gramStart"/>
-      <w:r>
-        <w:t>notes</w:t>
-      </w:r>
-      <w:proofErr w:type="gramEnd"/>
+        <w:t>12. References and methods notes</w:t>
+      </w:r>
     </w:p>
     <w:p>
       <w:r>
@@ -3962,6 +3858,7 @@
   <w:style w:type="character" w:default="1" w:styleId="a2">
     <w:name w:val="Default Paragraph Font"/>
     <w:uiPriority w:val="1"/>
+    <w:semiHidden/>
     <w:unhideWhenUsed/>
   </w:style>
   <w:style w:type="table" w:default="1" w:styleId="a3">

</xml_diff>